<commit_message>
Refresh sample UI and add isolated branch deployment routing
</commit_message>
<xml_diff>
--- a/docs/reference/DigitalCardBox System Design and Flowcharts.docx
+++ b/docs/reference/DigitalCardBox System Design and Flowcharts.docx
@@ -9882,6 +9882,29 @@
     <w:p>
       <w:r>
         <w:t xml:space="preserve">The preceding October dictionary replaces the older mixed-phase table list. Detailed types, indexes, FK contracts, exact authorization, retention and concurrency evidence are maintained in DATA_MODEL.md. UUIDs and same-event composite references preserve scope; customer email is not an ownership key. Consent, moderation and exports must recheck current exclusions. All five existing drawings and their media remain unchanged.</w:t>
+      </w:r>
+    </w:p>
+    <w:p>
+      <w:pPr>
+        <w:pStyle w:val="Heading1"/>
+      </w:pPr>
+      <w:r>
+        <w:t xml:space="preserve">DEV, TEST and PROD delivery – 13 October 2026</w:t>
+      </w:r>
+    </w:p>
+    <w:p>
+      <w:r>
+        <w:t xml:space="preserve">One GitHub repository uses GitHub Actions for static UI delivery. Feature branches create DEV previews under digitalcardbox-app-dev. Develop updates the stable digitalcardbox-app-test Worker, while release branches create separate TEST previews. Only master targets the existing digitalcardbox-app production Worker and customer URL, after the owner’s approval. Master begins from current production history with pipeline files only; feature UI changes are not promoted during setup. The previous main is retained as a frozen legacy reference during cutover.</w:t>
+      </w:r>
+    </w:p>
+    <w:p>
+      <w:r>
+        <w:t xml:space="preserve">The repository has one contributor. Required PR approvals are zero, and production deployment self-review is allowed for rcummings713. Build checks remain required. Deployment uses the checked build artifact and rejects an approval when master has moved. API tokens belong in GitHub environment secrets. Disable the existing Cloudflare Git-connected automatic builds so they cannot bypass the GitHub approval. The current local Cloudflare session cannot manage API tokens or Builds settings (HTTP 403), so those account settings require the owner’s action.</w:t>
+      </w:r>
+    </w:p>
+    <w:p>
+      <w:r>
+        <w:t xml:space="preserve">These are separate static deployment targets, not installed production databases or verified payment services. PostgreSQL and private storage remain environment-specific future work under ADR 0005 and DATA_MODEL.md; the server runtime choice in ADR 0001 stays open. ADR 0006 and planning/ENVIRONMENTS.md record the pipeline, solo release steps and rollback procedure.</w:t>
       </w:r>
     </w:p>
     <w:sectPr>

</xml_diff>

<commit_message>
Document Worker-specific deployment tokens and verified DEV TEST delivery
</commit_message>
<xml_diff>
--- a/docs/reference/DigitalCardBox System Design and Flowcharts.docx
+++ b/docs/reference/DigitalCardBox System Design and Flowcharts.docx
@@ -9898,6 +9898,21 @@
         <w:t>The free external pilot has no in-app premium checkout. A later 12–20-hour commerce increment can use provider-hosted standalone sales for $4.99 premium cards and $15/$30/$79 event books. One consented note or card submission included in the book counts once even with attached photos. Book prices reflect 0–99 / 100–299 / 300+ entries after day-90 close, with no guest capacity preselection or contribution cap. The host previews price and book free; a server-quoted checkout price and signed payment event grant a scoped entitlement. Basic CardVault and export remain. Store purchase ID, included-entry count, tier price, refund and entitlement, never payer card data. Gift payouts remain separate; a return URL alone cannot unlock a book.</w:t>
       </w:r>
     </w:p>
+    <w:p>
+      <w:r>
+        <w:t>Static deployment credentials and owner approval — ADR 0006</w:t>
+      </w:r>
+    </w:p>
+    <w:p>
+      <w:r>
+        <w:t>Use three distinct account-owned API tokens, one per GitHub environment, with Specified Workers / Individual Workers Editor access only to digitalcardbox-app-dev, digitalcardbox-app-test or digitalcardbox-app respectively. Keep the account ID as a public environment variable and each token as the matching environment secret. No whole-account, domain-route, Pages, KV, R2, Containers or Workers CI policy is required. The owner installed these tokens and DEV/TEST deployment retries succeeded on 13 October 2026.</w:t>
+      </w:r>
+    </w:p>
+    <w:p>
+      <w:r>
+        <w:t>One repository uses GitHub Actions: feature branches create DEV previews; develop updates stable TEST; release branches create TEST previews; master deploys PROD after the sole owner approves their own deployment. Required PR approving reviewers are zero; Build remains required. Disable the legacy Cloudflare Git-connected builds while keeping the existing production Worker running. This static workflow does not select a production backend or waive the private MVP release gates.</w:t>
+      </w:r>
+    </w:p>
     <w:sectPr>
       <w:footerReference w:type="default" r:id="rId9"/>
       <w:pgSz w:w="12240" w:h="15840"/>

</xml_diff>